<commit_message>
Deployed 3e436dc with MkDocs version: 1.6.1
</commit_message>
<xml_diff>
--- a/sample-output/CDE-2018-0117_application.docx
+++ b/sample-output/CDE-2018-0117_application.docx
@@ -182,7 +182,7 @@
                 <w:b w:val="0"/>
                 <w:sz w:val="22"/>
               </w:rPr>
-              <w:t>August 15, 2026</w:t>
+              <w:t>August 16, 2026</w:t>
             </w:r>
           </w:p>
         </w:tc>
@@ -269,7 +269,7 @@
         <w:rPr>
           <w:sz w:val="22"/>
         </w:rPr>
-        <w:t>Riverbend Community Capital CDE, LLC requests $65.0 million in New Markets Tax Credit allocation for CY2025. Our 20-project pipeline spans 20 states, with 87% of QEI committed to deep and severely distressed census tracts.</w:t>
+        <w:t>Riverbend Community Capital CDE, LLC requests $65.0 million in New Markets Tax Credit allocation for CY2025. Our 20-project pipeline spans 19 states, with 87% of QEI committed to deep and severely distressed census tracts.</w:t>
       </w:r>
     </w:p>
     <w:p/>
@@ -425,7 +425,7 @@
               <w:rPr>
                 <w:sz w:val="20"/>
               </w:rPr>
-              <w:t>20</w:t>
+              <w:t>19</w:t>
             </w:r>
           </w:p>
         </w:tc>
@@ -692,7 +692,7 @@
         <w:rPr>
           <w:sz w:val="22"/>
         </w:rPr>
-        <w:t>Riverbend Community Capital CDE, LLC will deploy $65.0 million in NMTC allocation across 20 projects in 20 states — targeting 87% of QEI in deep and severely distressed census tracts. The pipeline's largest sector concentration is healthcare.</w:t>
+        <w:t>Riverbend Community Capital CDE, LLC will deploy $65.0 million in NMTC allocation across 20 projects in 19 states — targeting 87% of QEI in deep and severely distressed census tracts. The pipeline's largest sector concentration is healthcare.</w:t>
       </w:r>
     </w:p>
     <w:p>
@@ -738,7 +738,7 @@
         <w:rPr>
           <w:sz w:val="22"/>
         </w:rPr>
-        <w:t>Per the flags supplied in this CDE's own pipeline submission, the pipeline places 15% of QEI in tracts declared as persistent-poverty counties and 3% in tracts declared High Migration Rural.</w:t>
+        <w:t>Per the persistent-poverty flags supplied in this CDE's own pipeline submission, the pipeline places 15% of QEI in tracts declared as persistent-poverty counties. 3% of QEI is in tracts recorded as High Migration Rural. This share is NOT solely the CDE's declaration: the high_migration_rural column of the pipeline submission is overwritten wherever nmtc-mapper returned a determination for the tract, so where the two disagree the figure above is the tool's, not the CDE's. Check it against your own submission before relying on it, and state which governs.</w:t>
       </w:r>
     </w:p>
     <w:p>
@@ -902,7 +902,7 @@
               <w:rPr>
                 <w:sz w:val="20"/>
               </w:rPr>
-              <w:t>20</w:t>
+              <w:t>19</w:t>
             </w:r>
           </w:p>
         </w:tc>
@@ -1240,7 +1240,7 @@
               <w:rPr>
                 <w:sz w:val="20"/>
               </w:rPr>
-              <w:t>QEI in Deep/Severely Distressed Tracts</w:t>
+              <w:t>QEI in Deep Distress Tracts (a share of QEI, not of QLICIs — see the basis note below)</w:t>
             </w:r>
           </w:p>
         </w:tc>
@@ -1254,7 +1254,7 @@
               <w:rPr>
                 <w:sz w:val="20"/>
               </w:rPr>
-              <w:t>86.7%</w:t>
+              <w:t>53.5%</w:t>
             </w:r>
           </w:p>
         </w:tc>
@@ -1270,7 +1270,7 @@
               <w:rPr>
                 <w:sz w:val="20"/>
               </w:rPr>
-              <w:t>QEI in LIC (Standard Eligible) Tracts</w:t>
+              <w:t>QEI in Severely Distressed Tracts, Deep Distress included (a share of QEI, not of QLICIs — see the basis note below)</w:t>
             </w:r>
           </w:p>
         </w:tc>
@@ -1284,7 +1284,7 @@
               <w:rPr>
                 <w:sz w:val="20"/>
               </w:rPr>
-              <w:t>13.3%</w:t>
+              <w:t>86.7%</w:t>
             </w:r>
           </w:p>
         </w:tc>
@@ -1300,7 +1300,7 @@
               <w:rPr>
                 <w:sz w:val="20"/>
               </w:rPr>
-              <w:t>QEI in NMTC Native Areas</w:t>
+              <w:t>— of which severely distressed but not also deep</w:t>
             </w:r>
           </w:p>
         </w:tc>
@@ -1314,7 +1314,7 @@
               <w:rPr>
                 <w:sz w:val="20"/>
               </w:rPr>
-              <w:t>10.0%</w:t>
+              <w:t>33.2%</w:t>
             </w:r>
           </w:p>
         </w:tc>
@@ -1330,7 +1330,7 @@
               <w:rPr>
                 <w:sz w:val="20"/>
               </w:rPr>
-              <w:t>QEI in High Migration Rural (HMR) Tracts</w:t>
+              <w:t>QEI in LIC (Standard Eligible) Tracts</w:t>
             </w:r>
           </w:p>
         </w:tc>
@@ -1344,7 +1344,7 @@
               <w:rPr>
                 <w:sz w:val="20"/>
               </w:rPr>
-              <w:t>2.6%</w:t>
+              <w:t>13.3%</w:t>
             </w:r>
           </w:p>
         </w:tc>
@@ -1360,7 +1360,7 @@
               <w:rPr>
                 <w:sz w:val="20"/>
               </w:rPr>
-              <w:t>CDFI Fund Higher-Distress Commitment (CY 2024-2025)</w:t>
+              <w:t>QEI in NMTC Native Areas (CDE-declared, not verified by this tool)</w:t>
             </w:r>
           </w:p>
         </w:tc>
@@ -1374,7 +1374,7 @@
               <w:rPr>
                 <w:sz w:val="20"/>
               </w:rPr>
-              <w:t>85% of QLICIs in areas of severe distress and/or multiple indicia of distress, and 20% in Deep Distress areas (CY 2024-2025 NMTC Program Review Process, Targeting Areas of Higher Distress, Question 25; the CY 2026 NOAA is not yet published)</w:t>
+              <w:t>10.0%</w:t>
             </w:r>
           </w:p>
         </w:tc>
@@ -1390,7 +1390,7 @@
               <w:rPr>
                 <w:sz w:val="20"/>
               </w:rPr>
-              <w:t>Riverbend Community Capital CDE, LLC Commitment (Deep/Severe)</w:t>
+              <w:t>QEI in High Migration Rural (HMR) Tracts</w:t>
             </w:r>
           </w:p>
         </w:tc>
@@ -1404,7 +1404,37 @@
               <w:rPr>
                 <w:sz w:val="20"/>
               </w:rPr>
-              <w:t>86.7%</w:t>
+              <w:t>2.6%</w:t>
+            </w:r>
+          </w:p>
+        </w:tc>
+      </w:tr>
+      <w:tr>
+        <w:tc>
+          <w:tcPr>
+            <w:tcW w:type="dxa" w:w="4320"/>
+            <w:shd w:val="clear" w:color="auto" w:fill="EBF0FA"/>
+          </w:tcPr>
+          <w:p>
+            <w:r>
+              <w:rPr>
+                <w:sz w:val="20"/>
+              </w:rPr>
+              <w:t>BASIS NOTE — the CDFI Fund's two distress commitments are measured on QLICIs, not on QEI</w:t>
+            </w:r>
+          </w:p>
+        </w:tc>
+        <w:tc>
+          <w:tcPr>
+            <w:tcW w:type="dxa" w:w="4320"/>
+            <w:shd w:val="clear" w:color="auto" w:fill="EBF0FA"/>
+          </w:tcPr>
+          <w:p>
+            <w:r>
+              <w:rPr>
+                <w:sz w:val="20"/>
+              </w:rPr>
+              <w:t>The CY 2024-2025 NMTC Program Review Process (Targeting Areas of Higher Distress, Question 25) states two commitments, and both are measured on QLICIs: at least 85% of QLICIs in specified areas of severe distress and/or areas characterized by multiple indicia of distress, and at least 20% of QLICIs to 'Deep Distress' areas. Every share in this table is a share of QEI. nmtc-application-builder computes neither QLICI-denominated figure — it reads this pipeline's QLICI amounts only to print them in Appendix A and to check that each is no larger than its QEI — so no figure above answers either commitment, and none may be presented to the CDFI Fund as doing so. Two further gaps in the higher-distress commitment: it covers severe distress OR MULTIPLE INDICIA of distress, and this package computes no multi-indicia measure at all, so even the QLICI-denominated severe-distress share would be incomplete against it; and Deep Distress is a strict subset of severe distress, so the second row above already includes the first. The CDE must compute both QLICI-denominated shares from its own QLICI amounts before stating either commitment. (The CY 2026 NOAA is not yet published.)</w:t>
             </w:r>
           </w:p>
         </w:tc>
@@ -2272,7 +2302,7 @@
               <w:rPr>
                 <w:sz w:val="20"/>
               </w:rPr>
-              <w:t>Net Subsidy to QALICBs ($)</w:t>
+              <w:t>QEI Less CDE Fees ($)</w:t>
             </w:r>
           </w:p>
         </w:tc>
@@ -2286,7 +2316,7 @@
               <w:rPr>
                 <w:sz w:val="20"/>
               </w:rPr>
-              <w:t>$119,437,500</w:t>
+              <w:t>$119,437,500 (not the QALICB's retained benefit — the $82.8MM leverage loan inside this figure is repaid or refinanced)</w:t>
             </w:r>
           </w:p>
         </w:tc>
@@ -2357,7 +2387,7 @@
         <w:rPr>
           <w:sz w:val="22"/>
         </w:rPr>
-        <w:t>Pipeline footprint: 20 states.</w:t>
+        <w:t>Pipeline footprint: 19 states.</w:t>
       </w:r>
     </w:p>
     <w:p>
@@ -2401,7 +2431,7 @@
         <w:br/>
         <w:t xml:space="preserve">  3. Combined proceeds flow through the CDE as QLICI loans. 3 of 20 projects are declared below-market-rate in this CDE's own pipeline submission; the terms of the remainder are not recorded here.</w:t>
         <w:br/>
-        <w:t xml:space="preserve">  4. Net subsidy to QALICBs: $119.4MM</w:t>
+        <w:t xml:space="preserve">  4. QEI less CDE fees: $119.4MM. This is not the QALICB's retained benefit — the $82.8MM leverage loan inside it is repaid or refinanced after the 7-year period.</w:t>
       </w:r>
     </w:p>
     <w:p>
@@ -2530,7 +2560,7 @@
         <w:rPr>
           <w:sz w:val="22"/>
         </w:rPr>
-        <w:t>The deployment history table below provides details on each prior award, including states served, sectors financed, and outcomes achieved.</w:t>
+        <w:t>The deployment history table below provides details on each prior award, including states served and sectors financed.</w:t>
       </w:r>
     </w:p>
     <w:p/>
@@ -2853,7 +2883,7 @@
               <w:rPr>
                 <w:sz w:val="20"/>
               </w:rPr>
-              <w:t>8500000</w:t>
+              <w:t>$8,500,000</w:t>
             </w:r>
           </w:p>
         </w:tc>
@@ -2867,7 +2897,7 @@
               <w:rPr>
                 <w:sz w:val="20"/>
               </w:rPr>
-              <w:t>12500000</w:t>
+              <w:t>$12,500,000</w:t>
             </w:r>
           </w:p>
         </w:tc>
@@ -2939,7 +2969,7 @@
               <w:rPr>
                 <w:sz w:val="20"/>
               </w:rPr>
-              <w:t>7000000</w:t>
+              <w:t>$7,000,000</w:t>
             </w:r>
           </w:p>
         </w:tc>
@@ -2953,7 +2983,7 @@
               <w:rPr>
                 <w:sz w:val="20"/>
               </w:rPr>
-              <w:t>9800000</w:t>
+              <w:t>$9,800,000</w:t>
             </w:r>
           </w:p>
         </w:tc>
@@ -3025,7 +3055,7 @@
               <w:rPr>
                 <w:sz w:val="20"/>
               </w:rPr>
-              <w:t>5000000</w:t>
+              <w:t>$5,000,000</w:t>
             </w:r>
           </w:p>
         </w:tc>
@@ -3039,7 +3069,7 @@
               <w:rPr>
                 <w:sz w:val="20"/>
               </w:rPr>
-              <w:t>7200000</w:t>
+              <w:t>$7,200,000</w:t>
             </w:r>
           </w:p>
         </w:tc>
@@ -3111,7 +3141,7 @@
               <w:rPr>
                 <w:sz w:val="20"/>
               </w:rPr>
-              <w:t>4500000</w:t>
+              <w:t>$4,500,000</w:t>
             </w:r>
           </w:p>
         </w:tc>
@@ -3125,7 +3155,7 @@
               <w:rPr>
                 <w:sz w:val="20"/>
               </w:rPr>
-              <w:t>6000000</w:t>
+              <w:t>$6,000,000</w:t>
             </w:r>
           </w:p>
         </w:tc>
@@ -3197,7 +3227,7 @@
               <w:rPr>
                 <w:sz w:val="20"/>
               </w:rPr>
-              <w:t>7500000</w:t>
+              <w:t>$7,500,000</w:t>
             </w:r>
           </w:p>
         </w:tc>
@@ -3211,7 +3241,7 @@
               <w:rPr>
                 <w:sz w:val="20"/>
               </w:rPr>
-              <w:t>10000000</w:t>
+              <w:t>$10,000,000</w:t>
             </w:r>
           </w:p>
         </w:tc>
@@ -3283,7 +3313,7 @@
               <w:rPr>
                 <w:sz w:val="20"/>
               </w:rPr>
-              <w:t>9000000</w:t>
+              <w:t>$9,000,000</w:t>
             </w:r>
           </w:p>
         </w:tc>
@@ -3297,7 +3327,7 @@
               <w:rPr>
                 <w:sz w:val="20"/>
               </w:rPr>
-              <w:t>14000000</w:t>
+              <w:t>$14,000,000</w:t>
             </w:r>
           </w:p>
         </w:tc>
@@ -3369,7 +3399,7 @@
               <w:rPr>
                 <w:sz w:val="20"/>
               </w:rPr>
-              <w:t>4000000</w:t>
+              <w:t>$4,000,000</w:t>
             </w:r>
           </w:p>
         </w:tc>
@@ -3383,7 +3413,7 @@
               <w:rPr>
                 <w:sz w:val="20"/>
               </w:rPr>
-              <w:t>5500000</w:t>
+              <w:t>$5,500,000</w:t>
             </w:r>
           </w:p>
         </w:tc>
@@ -3455,7 +3485,7 @@
               <w:rPr>
                 <w:sz w:val="20"/>
               </w:rPr>
-              <w:t>8000000</w:t>
+              <w:t>$8,000,000</w:t>
             </w:r>
           </w:p>
         </w:tc>
@@ -3469,7 +3499,7 @@
               <w:rPr>
                 <w:sz w:val="20"/>
               </w:rPr>
-              <w:t>11000000</w:t>
+              <w:t>$11,000,000</w:t>
             </w:r>
           </w:p>
         </w:tc>
@@ -3541,7 +3571,7 @@
               <w:rPr>
                 <w:sz w:val="20"/>
               </w:rPr>
-              <w:t>6000000</w:t>
+              <w:t>$6,000,000</w:t>
             </w:r>
           </w:p>
         </w:tc>
@@ -3555,7 +3585,7 @@
               <w:rPr>
                 <w:sz w:val="20"/>
               </w:rPr>
-              <w:t>8200000</w:t>
+              <w:t>$8,200,000</w:t>
             </w:r>
           </w:p>
         </w:tc>
@@ -3627,7 +3657,7 @@
               <w:rPr>
                 <w:sz w:val="20"/>
               </w:rPr>
-              <w:t>3500000</w:t>
+              <w:t>$3,500,000</w:t>
             </w:r>
           </w:p>
         </w:tc>
@@ -3641,7 +3671,7 @@
               <w:rPr>
                 <w:sz w:val="20"/>
               </w:rPr>
-              <w:t>4800000</w:t>
+              <w:t>$4,800,000</w:t>
             </w:r>
           </w:p>
         </w:tc>
@@ -3713,7 +3743,7 @@
               <w:rPr>
                 <w:sz w:val="20"/>
               </w:rPr>
-              <w:t>9500000</w:t>
+              <w:t>$9,500,000</w:t>
             </w:r>
           </w:p>
         </w:tc>
@@ -3727,7 +3757,7 @@
               <w:rPr>
                 <w:sz w:val="20"/>
               </w:rPr>
-              <w:t>13500000</w:t>
+              <w:t>$13,500,000</w:t>
             </w:r>
           </w:p>
         </w:tc>
@@ -3799,7 +3829,7 @@
               <w:rPr>
                 <w:sz w:val="20"/>
               </w:rPr>
-              <w:t>3800000</w:t>
+              <w:t>$3,800,000</w:t>
             </w:r>
           </w:p>
         </w:tc>
@@ -3813,7 +3843,7 @@
               <w:rPr>
                 <w:sz w:val="20"/>
               </w:rPr>
-              <w:t>5000000</w:t>
+              <w:t>$5,000,000</w:t>
             </w:r>
           </w:p>
         </w:tc>
@@ -3871,7 +3901,7 @@
               <w:rPr>
                 <w:sz w:val="20"/>
               </w:rPr>
-              <w:t>Deep Distress</w:t>
+              <w:t>Severely Distressed</w:t>
             </w:r>
           </w:p>
         </w:tc>
@@ -3885,7 +3915,7 @@
               <w:rPr>
                 <w:sz w:val="20"/>
               </w:rPr>
-              <w:t>5500000</w:t>
+              <w:t>$5,500,000</w:t>
             </w:r>
           </w:p>
         </w:tc>
@@ -3899,7 +3929,7 @@
               <w:rPr>
                 <w:sz w:val="20"/>
               </w:rPr>
-              <w:t>7500000</w:t>
+              <w:t>$7,500,000</w:t>
             </w:r>
           </w:p>
         </w:tc>
@@ -3971,7 +4001,7 @@
               <w:rPr>
                 <w:sz w:val="20"/>
               </w:rPr>
-              <w:t>6500000</w:t>
+              <w:t>$6,500,000</w:t>
             </w:r>
           </w:p>
         </w:tc>
@@ -3985,7 +4015,7 @@
               <w:rPr>
                 <w:sz w:val="20"/>
               </w:rPr>
-              <w:t>9000000</w:t>
+              <w:t>$9,000,000</w:t>
             </w:r>
           </w:p>
         </w:tc>
@@ -4057,7 +4087,7 @@
               <w:rPr>
                 <w:sz w:val="20"/>
               </w:rPr>
-              <w:t>5000000</w:t>
+              <w:t>$5,000,000</w:t>
             </w:r>
           </w:p>
         </w:tc>
@@ -4071,7 +4101,7 @@
               <w:rPr>
                 <w:sz w:val="20"/>
               </w:rPr>
-              <w:t>6500000</w:t>
+              <w:t>$6,500,000</w:t>
             </w:r>
           </w:p>
         </w:tc>
@@ -4143,7 +4173,7 @@
               <w:rPr>
                 <w:sz w:val="20"/>
               </w:rPr>
-              <w:t>7500000</w:t>
+              <w:t>$7,500,000</w:t>
             </w:r>
           </w:p>
         </w:tc>
@@ -4157,7 +4187,7 @@
               <w:rPr>
                 <w:sz w:val="20"/>
               </w:rPr>
-              <w:t>10500000</w:t>
+              <w:t>$10,500,000</w:t>
             </w:r>
           </w:p>
         </w:tc>
@@ -4229,7 +4259,7 @@
               <w:rPr>
                 <w:sz w:val="20"/>
               </w:rPr>
-              <w:t>3200000</w:t>
+              <w:t>$3,200,000</w:t>
             </w:r>
           </w:p>
         </w:tc>
@@ -4243,7 +4273,7 @@
               <w:rPr>
                 <w:sz w:val="20"/>
               </w:rPr>
-              <w:t>4200000</w:t>
+              <w:t>$4,200,000</w:t>
             </w:r>
           </w:p>
         </w:tc>
@@ -4287,7 +4317,7 @@
               <w:rPr>
                 <w:sz w:val="20"/>
               </w:rPr>
-              <w:t>KS</w:t>
+              <w:t>MO</w:t>
             </w:r>
           </w:p>
         </w:tc>
@@ -4315,7 +4345,7 @@
               <w:rPr>
                 <w:sz w:val="20"/>
               </w:rPr>
-              <w:t>8500000</w:t>
+              <w:t>$8,500,000</w:t>
             </w:r>
           </w:p>
         </w:tc>
@@ -4329,7 +4359,7 @@
               <w:rPr>
                 <w:sz w:val="20"/>
               </w:rPr>
-              <w:t>11800000</w:t>
+              <w:t>$11,800,000</w:t>
             </w:r>
           </w:p>
         </w:tc>
@@ -4401,7 +4431,7 @@
               <w:rPr>
                 <w:sz w:val="20"/>
               </w:rPr>
-              <w:t>4200000</w:t>
+              <w:t>$4,200,000</w:t>
             </w:r>
           </w:p>
         </w:tc>
@@ -4415,7 +4445,7 @@
               <w:rPr>
                 <w:sz w:val="20"/>
               </w:rPr>
-              <w:t>5800000</w:t>
+              <w:t>$5,800,000</w:t>
             </w:r>
           </w:p>
         </w:tc>
@@ -4487,7 +4517,7 @@
               <w:rPr>
                 <w:sz w:val="20"/>
               </w:rPr>
-              <w:t>5800000</w:t>
+              <w:t>$5,800,000</w:t>
             </w:r>
           </w:p>
         </w:tc>
@@ -4501,7 +4531,7 @@
               <w:rPr>
                 <w:sz w:val="20"/>
               </w:rPr>
-              <w:t>7800000</w:t>
+              <w:t>$7,800,000</w:t>
             </w:r>
           </w:p>
         </w:tc>
@@ -4576,7 +4606,7 @@
                 <w:b/>
                 <w:sz w:val="20"/>
               </w:rPr>
-              <w:t>122500000</w:t>
+              <w:t>$122,500,000</w:t>
             </w:r>
           </w:p>
         </w:tc>
@@ -4591,7 +4621,7 @@
                 <w:b/>
                 <w:sz w:val="20"/>
               </w:rPr>
-              <w:t>170600000</w:t>
+              <w:t>$170,600,000</w:t>
             </w:r>
           </w:p>
         </w:tc>
@@ -4784,7 +4814,7 @@
                 <w:color w:val="FFFFFF"/>
                 <w:sz w:val="14"/>
               </w:rPr>
-              <w:t>NMTC Native Area (Y/N)</w:t>
+              <w:t>NMTC Native Area (CDE-declared, Y/N)</w:t>
             </w:r>
           </w:p>
         </w:tc>
@@ -4993,7 +5023,7 @@
               <w:rPr>
                 <w:sz w:val="16"/>
               </w:rPr>
-              <w:t>8500000</w:t>
+              <w:t>$8,500,000</w:t>
             </w:r>
           </w:p>
         </w:tc>
@@ -5007,7 +5037,7 @@
               <w:rPr>
                 <w:sz w:val="16"/>
               </w:rPr>
-              <w:t>12500000</w:t>
+              <w:t>$12,500,000</w:t>
             </w:r>
           </w:p>
         </w:tc>
@@ -5163,7 +5193,7 @@
               <w:rPr>
                 <w:sz w:val="16"/>
               </w:rPr>
-              <w:t>7000000</w:t>
+              <w:t>$7,000,000</w:t>
             </w:r>
           </w:p>
         </w:tc>
@@ -5177,7 +5207,7 @@
               <w:rPr>
                 <w:sz w:val="16"/>
               </w:rPr>
-              <w:t>9800000</w:t>
+              <w:t>$9,800,000</w:t>
             </w:r>
           </w:p>
         </w:tc>
@@ -5333,7 +5363,7 @@
               <w:rPr>
                 <w:sz w:val="16"/>
               </w:rPr>
-              <w:t>5000000</w:t>
+              <w:t>$5,000,000</w:t>
             </w:r>
           </w:p>
         </w:tc>
@@ -5347,7 +5377,7 @@
               <w:rPr>
                 <w:sz w:val="16"/>
               </w:rPr>
-              <w:t>7200000</w:t>
+              <w:t>$7,200,000</w:t>
             </w:r>
           </w:p>
         </w:tc>
@@ -5503,7 +5533,7 @@
               <w:rPr>
                 <w:sz w:val="16"/>
               </w:rPr>
-              <w:t>4500000</w:t>
+              <w:t>$4,500,000</w:t>
             </w:r>
           </w:p>
         </w:tc>
@@ -5517,7 +5547,7 @@
               <w:rPr>
                 <w:sz w:val="16"/>
               </w:rPr>
-              <w:t>6000000</w:t>
+              <w:t>$6,000,000</w:t>
             </w:r>
           </w:p>
         </w:tc>
@@ -5673,7 +5703,7 @@
               <w:rPr>
                 <w:sz w:val="16"/>
               </w:rPr>
-              <w:t>7500000</w:t>
+              <w:t>$7,500,000</w:t>
             </w:r>
           </w:p>
         </w:tc>
@@ -5687,7 +5717,7 @@
               <w:rPr>
                 <w:sz w:val="16"/>
               </w:rPr>
-              <w:t>10000000</w:t>
+              <w:t>$10,000,000</w:t>
             </w:r>
           </w:p>
         </w:tc>
@@ -5843,7 +5873,7 @@
               <w:rPr>
                 <w:sz w:val="16"/>
               </w:rPr>
-              <w:t>9000000</w:t>
+              <w:t>$9,000,000</w:t>
             </w:r>
           </w:p>
         </w:tc>
@@ -5857,7 +5887,7 @@
               <w:rPr>
                 <w:sz w:val="16"/>
               </w:rPr>
-              <w:t>14000000</w:t>
+              <w:t>$14,000,000</w:t>
             </w:r>
           </w:p>
         </w:tc>
@@ -6013,7 +6043,7 @@
               <w:rPr>
                 <w:sz w:val="16"/>
               </w:rPr>
-              <w:t>4000000</w:t>
+              <w:t>$4,000,000</w:t>
             </w:r>
           </w:p>
         </w:tc>
@@ -6027,7 +6057,7 @@
               <w:rPr>
                 <w:sz w:val="16"/>
               </w:rPr>
-              <w:t>5500000</w:t>
+              <w:t>$5,500,000</w:t>
             </w:r>
           </w:p>
         </w:tc>
@@ -6183,7 +6213,7 @@
               <w:rPr>
                 <w:sz w:val="16"/>
               </w:rPr>
-              <w:t>8000000</w:t>
+              <w:t>$8,000,000</w:t>
             </w:r>
           </w:p>
         </w:tc>
@@ -6197,7 +6227,7 @@
               <w:rPr>
                 <w:sz w:val="16"/>
               </w:rPr>
-              <w:t>11000000</w:t>
+              <w:t>$11,000,000</w:t>
             </w:r>
           </w:p>
         </w:tc>
@@ -6353,7 +6383,7 @@
               <w:rPr>
                 <w:sz w:val="16"/>
               </w:rPr>
-              <w:t>6000000</w:t>
+              <w:t>$6,000,000</w:t>
             </w:r>
           </w:p>
         </w:tc>
@@ -6367,7 +6397,7 @@
               <w:rPr>
                 <w:sz w:val="16"/>
               </w:rPr>
-              <w:t>8200000</w:t>
+              <w:t>$8,200,000</w:t>
             </w:r>
           </w:p>
         </w:tc>
@@ -6523,7 +6553,7 @@
               <w:rPr>
                 <w:sz w:val="16"/>
               </w:rPr>
-              <w:t>3500000</w:t>
+              <w:t>$3,500,000</w:t>
             </w:r>
           </w:p>
         </w:tc>
@@ -6537,7 +6567,7 @@
               <w:rPr>
                 <w:sz w:val="16"/>
               </w:rPr>
-              <w:t>4800000</w:t>
+              <w:t>$4,800,000</w:t>
             </w:r>
           </w:p>
         </w:tc>
@@ -6693,7 +6723,7 @@
               <w:rPr>
                 <w:sz w:val="16"/>
               </w:rPr>
-              <w:t>9500000</w:t>
+              <w:t>$9,500,000</w:t>
             </w:r>
           </w:p>
         </w:tc>
@@ -6707,7 +6737,7 @@
               <w:rPr>
                 <w:sz w:val="16"/>
               </w:rPr>
-              <w:t>13500000</w:t>
+              <w:t>$13,500,000</w:t>
             </w:r>
           </w:p>
         </w:tc>
@@ -6863,7 +6893,7 @@
               <w:rPr>
                 <w:sz w:val="16"/>
               </w:rPr>
-              <w:t>3800000</w:t>
+              <w:t>$3,800,000</w:t>
             </w:r>
           </w:p>
         </w:tc>
@@ -6877,7 +6907,7 @@
               <w:rPr>
                 <w:sz w:val="16"/>
               </w:rPr>
-              <w:t>5000000</w:t>
+              <w:t>$5,000,000</w:t>
             </w:r>
           </w:p>
         </w:tc>
@@ -6991,7 +7021,7 @@
               <w:rPr>
                 <w:sz w:val="16"/>
               </w:rPr>
-              <w:t>Deep Distress</w:t>
+              <w:t>Severely Distressed</w:t>
             </w:r>
           </w:p>
         </w:tc>
@@ -7033,7 +7063,7 @@
               <w:rPr>
                 <w:sz w:val="16"/>
               </w:rPr>
-              <w:t>5500000</w:t>
+              <w:t>$5,500,000</w:t>
             </w:r>
           </w:p>
         </w:tc>
@@ -7047,7 +7077,7 @@
               <w:rPr>
                 <w:sz w:val="16"/>
               </w:rPr>
-              <w:t>7500000</w:t>
+              <w:t>$7,500,000</w:t>
             </w:r>
           </w:p>
         </w:tc>
@@ -7203,7 +7233,7 @@
               <w:rPr>
                 <w:sz w:val="16"/>
               </w:rPr>
-              <w:t>6500000</w:t>
+              <w:t>$6,500,000</w:t>
             </w:r>
           </w:p>
         </w:tc>
@@ -7217,7 +7247,7 @@
               <w:rPr>
                 <w:sz w:val="16"/>
               </w:rPr>
-              <w:t>9000000</w:t>
+              <w:t>$9,000,000</w:t>
             </w:r>
           </w:p>
         </w:tc>
@@ -7373,7 +7403,7 @@
               <w:rPr>
                 <w:sz w:val="16"/>
               </w:rPr>
-              <w:t>5000000</w:t>
+              <w:t>$5,000,000</w:t>
             </w:r>
           </w:p>
         </w:tc>
@@ -7387,7 +7417,7 @@
               <w:rPr>
                 <w:sz w:val="16"/>
               </w:rPr>
-              <w:t>6500000</w:t>
+              <w:t>$6,500,000</w:t>
             </w:r>
           </w:p>
         </w:tc>
@@ -7543,7 +7573,7 @@
               <w:rPr>
                 <w:sz w:val="16"/>
               </w:rPr>
-              <w:t>7500000</w:t>
+              <w:t>$7,500,000</w:t>
             </w:r>
           </w:p>
         </w:tc>
@@ -7557,7 +7587,7 @@
               <w:rPr>
                 <w:sz w:val="16"/>
               </w:rPr>
-              <w:t>10500000</w:t>
+              <w:t>$10,500,000</w:t>
             </w:r>
           </w:p>
         </w:tc>
@@ -7713,7 +7743,7 @@
               <w:rPr>
                 <w:sz w:val="16"/>
               </w:rPr>
-              <w:t>3200000</w:t>
+              <w:t>$3,200,000</w:t>
             </w:r>
           </w:p>
         </w:tc>
@@ -7727,7 +7757,7 @@
               <w:rPr>
                 <w:sz w:val="16"/>
               </w:rPr>
-              <w:t>4200000</w:t>
+              <w:t>$4,200,000</w:t>
             </w:r>
           </w:p>
         </w:tc>
@@ -7827,7 +7857,7 @@
               <w:rPr>
                 <w:sz w:val="16"/>
               </w:rPr>
-              <w:t>KS</w:t>
+              <w:t>MO</w:t>
             </w:r>
           </w:p>
         </w:tc>
@@ -7883,7 +7913,7 @@
               <w:rPr>
                 <w:sz w:val="16"/>
               </w:rPr>
-              <w:t>8500000</w:t>
+              <w:t>$8,500,000</w:t>
             </w:r>
           </w:p>
         </w:tc>
@@ -7897,7 +7927,7 @@
               <w:rPr>
                 <w:sz w:val="16"/>
               </w:rPr>
-              <w:t>11800000</w:t>
+              <w:t>$11,800,000</w:t>
             </w:r>
           </w:p>
         </w:tc>
@@ -8053,7 +8083,7 @@
               <w:rPr>
                 <w:sz w:val="16"/>
               </w:rPr>
-              <w:t>4200000</w:t>
+              <w:t>$4,200,000</w:t>
             </w:r>
           </w:p>
         </w:tc>
@@ -8067,7 +8097,7 @@
               <w:rPr>
                 <w:sz w:val="16"/>
               </w:rPr>
-              <w:t>5800000</w:t>
+              <w:t>$5,800,000</w:t>
             </w:r>
           </w:p>
         </w:tc>
@@ -8223,7 +8253,7 @@
               <w:rPr>
                 <w:sz w:val="16"/>
               </w:rPr>
-              <w:t>5800000</w:t>
+              <w:t>$5,800,000</w:t>
             </w:r>
           </w:p>
         </w:tc>
@@ -8237,7 +8267,7 @@
               <w:rPr>
                 <w:sz w:val="16"/>
               </w:rPr>
-              <w:t>7800000</w:t>
+              <w:t>$7,800,000</w:t>
             </w:r>
           </w:p>
         </w:tc>
@@ -8396,7 +8426,7 @@
                 <w:b/>
                 <w:sz w:val="16"/>
               </w:rPr>
-              <w:t>122500000</w:t>
+              <w:t>$122,500,000</w:t>
             </w:r>
           </w:p>
         </w:tc>
@@ -8411,7 +8441,7 @@
                 <w:b/>
                 <w:sz w:val="16"/>
               </w:rPr>
-              <w:t>170600000</w:t>
+              <w:t>$170,600,000</w:t>
             </w:r>
           </w:p>
         </w:tc>
@@ -8677,7 +8707,7 @@
                 <w:color w:val="FFFFFF"/>
                 <w:sz w:val="14"/>
               </w:rPr>
-              <w:t>NMTC Native Area</w:t>
+              <w:t>NMTC Native Area (CDE-declared)</w:t>
             </w:r>
           </w:p>
         </w:tc>
@@ -11412,7 +11442,7 @@
               <w:rPr>
                 <w:sz w:val="16"/>
               </w:rPr>
-              <w:t>37119001900</w:t>
+              <w:t>37119004200</w:t>
             </w:r>
           </w:p>
         </w:tc>
@@ -11440,7 +11470,7 @@
               <w:rPr>
                 <w:sz w:val="16"/>
               </w:rPr>
-              <w:t>Deep Distress</w:t>
+              <w:t>Severely Distressed</w:t>
             </w:r>
           </w:p>
         </w:tc>
@@ -12458,7 +12488,7 @@
               <w:rPr>
                 <w:sz w:val="16"/>
               </w:rPr>
-              <w:t>Kansas City, KS</w:t>
+              <w:t>Kansas City, MO</w:t>
             </w:r>
           </w:p>
         </w:tc>
@@ -12472,7 +12502,7 @@
               <w:rPr>
                 <w:sz w:val="16"/>
               </w:rPr>
-              <w:t>20091000100</w:t>
+              <w:t>29095017800</w:t>
             </w:r>
           </w:p>
         </w:tc>
@@ -13433,7 +13463,7 @@
                 <w:color w:val="FFFFFF"/>
                 <w:sz w:val="20"/>
               </w:rPr>
-              <w:t>Native Area Projects</w:t>
+              <w:t>Native Area Projects (CDE-declared)</w:t>
             </w:r>
           </w:p>
         </w:tc>
@@ -14171,7 +14201,7 @@
               <w:rPr>
                 <w:sz w:val="20"/>
               </w:rPr>
-              <w:t>KS</w:t>
+              <w:t>LA</w:t>
             </w:r>
           </w:p>
         </w:tc>
@@ -14199,7 +14229,7 @@
               <w:rPr>
                 <w:sz w:val="20"/>
               </w:rPr>
-              <w:t>$8,500,000</w:t>
+              <w:t>$6,000,000</w:t>
             </w:r>
           </w:p>
         </w:tc>
@@ -14213,7 +14243,7 @@
               <w:rPr>
                 <w:sz w:val="20"/>
               </w:rPr>
-              <w:t>6.9%</w:t>
+              <w:t>4.9%</w:t>
             </w:r>
           </w:p>
         </w:tc>
@@ -14227,6 +14257,20 @@
               <w:rPr>
                 <w:sz w:val="20"/>
               </w:rPr>
+              <w:t>1</w:t>
+            </w:r>
+          </w:p>
+        </w:tc>
+        <w:tc>
+          <w:tcPr>
+            <w:tcW w:type="dxa" w:w="1080"/>
+            <w:shd w:val="clear" w:color="auto" w:fill="EBF0FA"/>
+          </w:tcPr>
+          <w:p>
+            <w:r>
+              <w:rPr>
+                <w:sz w:val="20"/>
+              </w:rPr>
               <w:t>0</w:t>
             </w:r>
           </w:p>
@@ -14255,21 +14299,7 @@
               <w:rPr>
                 <w:sz w:val="20"/>
               </w:rPr>
-              <w:t>0</w:t>
-            </w:r>
-          </w:p>
-        </w:tc>
-        <w:tc>
-          <w:tcPr>
-            <w:tcW w:type="dxa" w:w="1080"/>
-            <w:shd w:val="clear" w:color="auto" w:fill="EBF0FA"/>
-          </w:tcPr>
-          <w:p>
-            <w:r>
-              <w:rPr>
-                <w:sz w:val="20"/>
-              </w:rPr>
-              <w:t>0</w:t>
+              <w:t>1</w:t>
             </w:r>
           </w:p>
         </w:tc>
@@ -14285,7 +14315,7 @@
               <w:rPr>
                 <w:sz w:val="20"/>
               </w:rPr>
-              <w:t>LA</w:t>
+              <w:t>MD</w:t>
             </w:r>
           </w:p>
         </w:tc>
@@ -14313,7 +14343,7 @@
               <w:rPr>
                 <w:sz w:val="20"/>
               </w:rPr>
-              <w:t>$6,000,000</w:t>
+              <w:t>$4,200,000</w:t>
             </w:r>
           </w:p>
         </w:tc>
@@ -14327,7 +14357,7 @@
               <w:rPr>
                 <w:sz w:val="20"/>
               </w:rPr>
-              <w:t>4.9%</w:t>
+              <w:t>3.4%</w:t>
             </w:r>
           </w:p>
         </w:tc>
@@ -14383,7 +14413,7 @@
               <w:rPr>
                 <w:sz w:val="20"/>
               </w:rPr>
-              <w:t>1</w:t>
+              <w:t>0</w:t>
             </w:r>
           </w:p>
         </w:tc>
@@ -14399,7 +14429,7 @@
               <w:rPr>
                 <w:sz w:val="20"/>
               </w:rPr>
-              <w:t>MD</w:t>
+              <w:t>MI</w:t>
             </w:r>
           </w:p>
         </w:tc>
@@ -14427,7 +14457,7 @@
               <w:rPr>
                 <w:sz w:val="20"/>
               </w:rPr>
-              <w:t>$4,200,000</w:t>
+              <w:t>$5,000,000</w:t>
             </w:r>
           </w:p>
         </w:tc>
@@ -14441,7 +14471,7 @@
               <w:rPr>
                 <w:sz w:val="20"/>
               </w:rPr>
-              <w:t>3.4%</w:t>
+              <w:t>4.1%</w:t>
             </w:r>
           </w:p>
         </w:tc>
@@ -14497,7 +14527,7 @@
               <w:rPr>
                 <w:sz w:val="20"/>
               </w:rPr>
-              <w:t>0</w:t>
+              <w:t>1</w:t>
             </w:r>
           </w:p>
         </w:tc>
@@ -14513,7 +14543,7 @@
               <w:rPr>
                 <w:sz w:val="20"/>
               </w:rPr>
-              <w:t>MI</w:t>
+              <w:t>MO</w:t>
             </w:r>
           </w:p>
         </w:tc>
@@ -14527,7 +14557,7 @@
               <w:rPr>
                 <w:sz w:val="20"/>
               </w:rPr>
-              <w:t>1</w:t>
+              <w:t>2</w:t>
             </w:r>
           </w:p>
         </w:tc>
@@ -14541,7 +14571,7 @@
               <w:rPr>
                 <w:sz w:val="20"/>
               </w:rPr>
-              <w:t>$5,000,000</w:t>
+              <w:t>$12,300,000</w:t>
             </w:r>
           </w:p>
         </w:tc>
@@ -14555,7 +14585,7 @@
               <w:rPr>
                 <w:sz w:val="20"/>
               </w:rPr>
-              <w:t>4.1%</w:t>
+              <w:t>10.0%</w:t>
             </w:r>
           </w:p>
         </w:tc>
@@ -14569,7 +14599,7 @@
               <w:rPr>
                 <w:sz w:val="20"/>
               </w:rPr>
-              <w:t>1</w:t>
+              <w:t>0</w:t>
             </w:r>
           </w:p>
         </w:tc>
@@ -14627,7 +14657,7 @@
               <w:rPr>
                 <w:sz w:val="20"/>
               </w:rPr>
-              <w:t>MO</w:t>
+              <w:t>MS</w:t>
             </w:r>
           </w:p>
         </w:tc>
@@ -14655,7 +14685,7 @@
               <w:rPr>
                 <w:sz w:val="20"/>
               </w:rPr>
-              <w:t>$3,800,000</w:t>
+              <w:t>$3,200,000</w:t>
             </w:r>
           </w:p>
         </w:tc>
@@ -14669,7 +14699,7 @@
               <w:rPr>
                 <w:sz w:val="20"/>
               </w:rPr>
-              <w:t>3.1%</w:t>
+              <w:t>2.6%</w:t>
             </w:r>
           </w:p>
         </w:tc>
@@ -14683,6 +14713,20 @@
               <w:rPr>
                 <w:sz w:val="20"/>
               </w:rPr>
+              <w:t>1</w:t>
+            </w:r>
+          </w:p>
+        </w:tc>
+        <w:tc>
+          <w:tcPr>
+            <w:tcW w:type="dxa" w:w="1080"/>
+            <w:shd w:val="clear" w:color="auto" w:fill="EBF0FA"/>
+          </w:tcPr>
+          <w:p>
+            <w:r>
+              <w:rPr>
+                <w:sz w:val="20"/>
+              </w:rPr>
               <w:t>0</w:t>
             </w:r>
           </w:p>
@@ -14697,35 +14741,21 @@
               <w:rPr>
                 <w:sz w:val="20"/>
               </w:rPr>
+              <w:t>1</w:t>
+            </w:r>
+          </w:p>
+        </w:tc>
+        <w:tc>
+          <w:tcPr>
+            <w:tcW w:type="dxa" w:w="1080"/>
+            <w:shd w:val="clear" w:color="auto" w:fill="EBF0FA"/>
+          </w:tcPr>
+          <w:p>
+            <w:r>
+              <w:rPr>
+                <w:sz w:val="20"/>
+              </w:rPr>
               <w:t>0</w:t>
-            </w:r>
-          </w:p>
-        </w:tc>
-        <w:tc>
-          <w:tcPr>
-            <w:tcW w:type="dxa" w:w="1080"/>
-            <w:shd w:val="clear" w:color="auto" w:fill="EBF0FA"/>
-          </w:tcPr>
-          <w:p>
-            <w:r>
-              <w:rPr>
-                <w:sz w:val="20"/>
-              </w:rPr>
-              <w:t>0</w:t>
-            </w:r>
-          </w:p>
-        </w:tc>
-        <w:tc>
-          <w:tcPr>
-            <w:tcW w:type="dxa" w:w="1080"/>
-            <w:shd w:val="clear" w:color="auto" w:fill="EBF0FA"/>
-          </w:tcPr>
-          <w:p>
-            <w:r>
-              <w:rPr>
-                <w:sz w:val="20"/>
-              </w:rPr>
-              <w:t>1</w:t>
             </w:r>
           </w:p>
         </w:tc>
@@ -14741,7 +14771,7 @@
               <w:rPr>
                 <w:sz w:val="20"/>
               </w:rPr>
-              <w:t>MS</w:t>
+              <w:t>NC</w:t>
             </w:r>
           </w:p>
         </w:tc>
@@ -14769,7 +14799,7 @@
               <w:rPr>
                 <w:sz w:val="20"/>
               </w:rPr>
-              <w:t>$3,200,000</w:t>
+              <w:t>$5,500,000</w:t>
             </w:r>
           </w:p>
         </w:tc>
@@ -14783,7 +14813,7 @@
               <w:rPr>
                 <w:sz w:val="20"/>
               </w:rPr>
-              <w:t>2.6%</w:t>
+              <w:t>4.5%</w:t>
             </w:r>
           </w:p>
         </w:tc>
@@ -14825,7 +14855,7 @@
               <w:rPr>
                 <w:sz w:val="20"/>
               </w:rPr>
-              <w:t>1</w:t>
+              <w:t>0</w:t>
             </w:r>
           </w:p>
         </w:tc>
@@ -14855,7 +14885,7 @@
               <w:rPr>
                 <w:sz w:val="20"/>
               </w:rPr>
-              <w:t>NC</w:t>
+              <w:t>NM</w:t>
             </w:r>
           </w:p>
         </w:tc>
@@ -14883,7 +14913,7 @@
               <w:rPr>
                 <w:sz w:val="20"/>
               </w:rPr>
-              <w:t>$5,500,000</w:t>
+              <w:t>$5,800,000</w:t>
             </w:r>
           </w:p>
         </w:tc>
@@ -14897,7 +14927,7 @@
               <w:rPr>
                 <w:sz w:val="20"/>
               </w:rPr>
-              <w:t>4.5%</w:t>
+              <w:t>4.7%</w:t>
             </w:r>
           </w:p>
         </w:tc>
@@ -14925,6 +14955,20 @@
               <w:rPr>
                 <w:sz w:val="20"/>
               </w:rPr>
+              <w:t>1</w:t>
+            </w:r>
+          </w:p>
+        </w:tc>
+        <w:tc>
+          <w:tcPr>
+            <w:tcW w:type="dxa" w:w="1080"/>
+            <w:shd w:val="clear" w:color="auto" w:fill="EBF0FA"/>
+          </w:tcPr>
+          <w:p>
+            <w:r>
+              <w:rPr>
+                <w:sz w:val="20"/>
+              </w:rPr>
               <w:t>0</w:t>
             </w:r>
           </w:p>
@@ -14939,21 +14983,7 @@
               <w:rPr>
                 <w:sz w:val="20"/>
               </w:rPr>
-              <w:t>0</w:t>
-            </w:r>
-          </w:p>
-        </w:tc>
-        <w:tc>
-          <w:tcPr>
-            <w:tcW w:type="dxa" w:w="1080"/>
-            <w:shd w:val="clear" w:color="auto" w:fill="EBF0FA"/>
-          </w:tcPr>
-          <w:p>
-            <w:r>
-              <w:rPr>
-                <w:sz w:val="20"/>
-              </w:rPr>
-              <w:t>0</w:t>
+              <w:t>1</w:t>
             </w:r>
           </w:p>
         </w:tc>
@@ -14969,7 +14999,7 @@
               <w:rPr>
                 <w:sz w:val="20"/>
               </w:rPr>
-              <w:t>NM</w:t>
+              <w:t>NY</w:t>
             </w:r>
           </w:p>
         </w:tc>
@@ -14997,7 +15027,7 @@
               <w:rPr>
                 <w:sz w:val="20"/>
               </w:rPr>
-              <w:t>$5,800,000</w:t>
+              <w:t>$5,000,000</w:t>
             </w:r>
           </w:p>
         </w:tc>
@@ -15011,7 +15041,7 @@
               <w:rPr>
                 <w:sz w:val="20"/>
               </w:rPr>
-              <w:t>4.7%</w:t>
+              <w:t>4.1%</w:t>
             </w:r>
           </w:p>
         </w:tc>
@@ -15039,7 +15069,7 @@
               <w:rPr>
                 <w:sz w:val="20"/>
               </w:rPr>
-              <w:t>1</w:t>
+              <w:t>0</w:t>
             </w:r>
           </w:p>
         </w:tc>
@@ -15083,7 +15113,7 @@
               <w:rPr>
                 <w:sz w:val="20"/>
               </w:rPr>
-              <w:t>NY</w:t>
+              <w:t>OH</w:t>
             </w:r>
           </w:p>
         </w:tc>
@@ -15111,7 +15141,7 @@
               <w:rPr>
                 <w:sz w:val="20"/>
               </w:rPr>
-              <w:t>$5,000,000</w:t>
+              <w:t>$7,500,000</w:t>
             </w:r>
           </w:p>
         </w:tc>
@@ -15125,7 +15155,7 @@
               <w:rPr>
                 <w:sz w:val="20"/>
               </w:rPr>
-              <w:t>4.1%</w:t>
+              <w:t>6.1%</w:t>
             </w:r>
           </w:p>
         </w:tc>
@@ -15181,7 +15211,7 @@
               <w:rPr>
                 <w:sz w:val="20"/>
               </w:rPr>
-              <w:t>1</w:t>
+              <w:t>0</w:t>
             </w:r>
           </w:p>
         </w:tc>
@@ -15197,7 +15227,7 @@
               <w:rPr>
                 <w:sz w:val="20"/>
               </w:rPr>
-              <w:t>OH</w:t>
+              <w:t>PA</w:t>
             </w:r>
           </w:p>
         </w:tc>
@@ -15225,7 +15255,7 @@
               <w:rPr>
                 <w:sz w:val="20"/>
               </w:rPr>
-              <w:t>$7,500,000</w:t>
+              <w:t>$8,000,000</w:t>
             </w:r>
           </w:p>
         </w:tc>
@@ -15239,7 +15269,7 @@
               <w:rPr>
                 <w:sz w:val="20"/>
               </w:rPr>
-              <w:t>6.1%</w:t>
+              <w:t>6.5%</w:t>
             </w:r>
           </w:p>
         </w:tc>
@@ -15311,7 +15341,7 @@
               <w:rPr>
                 <w:sz w:val="20"/>
               </w:rPr>
-              <w:t>PA</w:t>
+              <w:t>TN</w:t>
             </w:r>
           </w:p>
         </w:tc>
@@ -15339,7 +15369,7 @@
               <w:rPr>
                 <w:sz w:val="20"/>
               </w:rPr>
-              <w:t>$8,000,000</w:t>
+              <w:t>$3,500,000</w:t>
             </w:r>
           </w:p>
         </w:tc>
@@ -15353,7 +15383,7 @@
               <w:rPr>
                 <w:sz w:val="20"/>
               </w:rPr>
-              <w:t>6.5%</w:t>
+              <w:t>2.9%</w:t>
             </w:r>
           </w:p>
         </w:tc>
@@ -15425,7 +15455,7 @@
               <w:rPr>
                 <w:sz w:val="20"/>
               </w:rPr>
-              <w:t>TN</w:t>
+              <w:t>TX</w:t>
             </w:r>
           </w:p>
         </w:tc>
@@ -15453,7 +15483,7 @@
               <w:rPr>
                 <w:sz w:val="20"/>
               </w:rPr>
-              <w:t>$3,500,000</w:t>
+              <w:t>$7,000,000</w:t>
             </w:r>
           </w:p>
         </w:tc>
@@ -15467,7 +15497,7 @@
               <w:rPr>
                 <w:sz w:val="20"/>
               </w:rPr>
-              <w:t>2.9%</w:t>
+              <w:t>5.7%</w:t>
             </w:r>
           </w:p>
         </w:tc>
@@ -15523,7 +15553,7 @@
               <w:rPr>
                 <w:sz w:val="20"/>
               </w:rPr>
-              <w:t>0</w:t>
+              <w:t>1</w:t>
             </w:r>
           </w:p>
         </w:tc>
@@ -15539,7 +15569,7 @@
               <w:rPr>
                 <w:sz w:val="20"/>
               </w:rPr>
-              <w:t>TX</w:t>
+              <w:t>WI</w:t>
             </w:r>
           </w:p>
         </w:tc>
@@ -15567,7 +15597,7 @@
               <w:rPr>
                 <w:sz w:val="20"/>
               </w:rPr>
-              <w:t>$7,000,000</w:t>
+              <w:t>$9,500,000</w:t>
             </w:r>
           </w:p>
         </w:tc>
@@ -15581,7 +15611,7 @@
               <w:rPr>
                 <w:sz w:val="20"/>
               </w:rPr>
-              <w:t>5.7%</w:t>
+              <w:t>7.8%</w:t>
             </w:r>
           </w:p>
         </w:tc>
@@ -15631,120 +15661,6 @@
           <w:tcPr>
             <w:tcW w:type="dxa" w:w="1080"/>
             <w:shd w:val="clear" w:color="auto" w:fill="EBF0FA"/>
-          </w:tcPr>
-          <w:p>
-            <w:r>
-              <w:rPr>
-                <w:sz w:val="20"/>
-              </w:rPr>
-              <w:t>1</w:t>
-            </w:r>
-          </w:p>
-        </w:tc>
-      </w:tr>
-      <w:tr>
-        <w:tc>
-          <w:tcPr>
-            <w:tcW w:type="dxa" w:w="1080"/>
-            <w:shd w:val="clear" w:color="auto" w:fill="FFFFFF"/>
-          </w:tcPr>
-          <w:p>
-            <w:r>
-              <w:rPr>
-                <w:sz w:val="20"/>
-              </w:rPr>
-              <w:t>WI</w:t>
-            </w:r>
-          </w:p>
-        </w:tc>
-        <w:tc>
-          <w:tcPr>
-            <w:tcW w:type="dxa" w:w="1080"/>
-            <w:shd w:val="clear" w:color="auto" w:fill="FFFFFF"/>
-          </w:tcPr>
-          <w:p>
-            <w:r>
-              <w:rPr>
-                <w:sz w:val="20"/>
-              </w:rPr>
-              <w:t>1</w:t>
-            </w:r>
-          </w:p>
-        </w:tc>
-        <w:tc>
-          <w:tcPr>
-            <w:tcW w:type="dxa" w:w="1080"/>
-            <w:shd w:val="clear" w:color="auto" w:fill="FFFFFF"/>
-          </w:tcPr>
-          <w:p>
-            <w:r>
-              <w:rPr>
-                <w:sz w:val="20"/>
-              </w:rPr>
-              <w:t>$9,500,000</w:t>
-            </w:r>
-          </w:p>
-        </w:tc>
-        <w:tc>
-          <w:tcPr>
-            <w:tcW w:type="dxa" w:w="1080"/>
-            <w:shd w:val="clear" w:color="auto" w:fill="FFFFFF"/>
-          </w:tcPr>
-          <w:p>
-            <w:r>
-              <w:rPr>
-                <w:sz w:val="20"/>
-              </w:rPr>
-              <w:t>7.8%</w:t>
-            </w:r>
-          </w:p>
-        </w:tc>
-        <w:tc>
-          <w:tcPr>
-            <w:tcW w:type="dxa" w:w="1080"/>
-            <w:shd w:val="clear" w:color="auto" w:fill="FFFFFF"/>
-          </w:tcPr>
-          <w:p>
-            <w:r>
-              <w:rPr>
-                <w:sz w:val="20"/>
-              </w:rPr>
-              <w:t>1</w:t>
-            </w:r>
-          </w:p>
-        </w:tc>
-        <w:tc>
-          <w:tcPr>
-            <w:tcW w:type="dxa" w:w="1080"/>
-            <w:shd w:val="clear" w:color="auto" w:fill="FFFFFF"/>
-          </w:tcPr>
-          <w:p>
-            <w:r>
-              <w:rPr>
-                <w:sz w:val="20"/>
-              </w:rPr>
-              <w:t>0</w:t>
-            </w:r>
-          </w:p>
-        </w:tc>
-        <w:tc>
-          <w:tcPr>
-            <w:tcW w:type="dxa" w:w="1080"/>
-            <w:shd w:val="clear" w:color="auto" w:fill="FFFFFF"/>
-          </w:tcPr>
-          <w:p>
-            <w:r>
-              <w:rPr>
-                <w:sz w:val="20"/>
-              </w:rPr>
-              <w:t>0</w:t>
-            </w:r>
-          </w:p>
-        </w:tc>
-        <w:tc>
-          <w:tcPr>
-            <w:tcW w:type="dxa" w:w="1080"/>
-            <w:shd w:val="clear" w:color="auto" w:fill="FFFFFF"/>
           </w:tcPr>
           <w:p>
             <w:r>
@@ -16118,7 +16034,7 @@
               <w:rPr>
                 <w:sz w:val="20"/>
               </w:rPr>
-              <w:t>8500000</w:t>
+              <w:t>$8,500,000</w:t>
             </w:r>
           </w:p>
         </w:tc>
@@ -16132,7 +16048,7 @@
               <w:rPr>
                 <w:sz w:val="20"/>
               </w:rPr>
-              <w:t>240385</w:t>
+              <w:t>$240,385</w:t>
             </w:r>
           </w:p>
         </w:tc>
@@ -16218,7 +16134,7 @@
               <w:rPr>
                 <w:sz w:val="20"/>
               </w:rPr>
-              <w:t>7000000</w:t>
+              <w:t>$7,000,000</w:t>
             </w:r>
           </w:p>
         </w:tc>
@@ -16232,7 +16148,7 @@
               <w:rPr>
                 <w:sz w:val="20"/>
               </w:rPr>
-              <w:t>257895</w:t>
+              <w:t>$257,895</w:t>
             </w:r>
           </w:p>
         </w:tc>
@@ -16318,7 +16234,7 @@
               <w:rPr>
                 <w:sz w:val="20"/>
               </w:rPr>
-              <w:t>5000000</w:t>
+              <w:t>$5,000,000</w:t>
             </w:r>
           </w:p>
         </w:tc>
@@ -16332,7 +16248,7 @@
               <w:rPr>
                 <w:sz w:val="20"/>
               </w:rPr>
-              <w:t>110769</w:t>
+              <w:t>$110,769</w:t>
             </w:r>
           </w:p>
         </w:tc>
@@ -16418,7 +16334,7 @@
               <w:rPr>
                 <w:sz w:val="20"/>
               </w:rPr>
-              <w:t>4500000</w:t>
+              <w:t>$4,500,000</w:t>
             </w:r>
           </w:p>
         </w:tc>
@@ -16432,7 +16348,7 @@
               <w:rPr>
                 <w:sz w:val="20"/>
               </w:rPr>
-              <w:t>75000</w:t>
+              <w:t>$75,000</w:t>
             </w:r>
           </w:p>
         </w:tc>
@@ -16518,7 +16434,7 @@
               <w:rPr>
                 <w:sz w:val="20"/>
               </w:rPr>
-              <w:t>7500000</w:t>
+              <w:t>$7,500,000</w:t>
             </w:r>
           </w:p>
         </w:tc>
@@ -16532,7 +16448,7 @@
               <w:rPr>
                 <w:sz w:val="20"/>
               </w:rPr>
-              <w:t>238095</w:t>
+              <w:t>$238,095</w:t>
             </w:r>
           </w:p>
         </w:tc>
@@ -16618,7 +16534,7 @@
               <w:rPr>
                 <w:sz w:val="20"/>
               </w:rPr>
-              <w:t>9000000</w:t>
+              <w:t>$9,000,000</w:t>
             </w:r>
           </w:p>
         </w:tc>
@@ -16632,7 +16548,7 @@
               <w:rPr>
                 <w:sz w:val="20"/>
               </w:rPr>
-              <w:t>933333</w:t>
+              <w:t>$933,333</w:t>
             </w:r>
           </w:p>
         </w:tc>
@@ -16718,7 +16634,7 @@
               <w:rPr>
                 <w:sz w:val="20"/>
               </w:rPr>
-              <w:t>4000000</w:t>
+              <w:t>$4,000,000</w:t>
             </w:r>
           </w:p>
         </w:tc>
@@ -16732,7 +16648,7 @@
               <w:rPr>
                 <w:sz w:val="20"/>
               </w:rPr>
-              <w:t>196429</w:t>
+              <w:t>$196,429</w:t>
             </w:r>
           </w:p>
         </w:tc>
@@ -16818,7 +16734,7 @@
               <w:rPr>
                 <w:sz w:val="20"/>
               </w:rPr>
-              <w:t>8000000</w:t>
+              <w:t>$8,000,000</w:t>
             </w:r>
           </w:p>
         </w:tc>
@@ -16832,7 +16748,7 @@
               <w:rPr>
                 <w:sz w:val="20"/>
               </w:rPr>
-              <w:t>200000</w:t>
+              <w:t>$200,000</w:t>
             </w:r>
           </w:p>
         </w:tc>
@@ -16918,7 +16834,7 @@
               <w:rPr>
                 <w:sz w:val="20"/>
               </w:rPr>
-              <w:t>6000000</w:t>
+              <w:t>$6,000,000</w:t>
             </w:r>
           </w:p>
         </w:tc>
@@ -16932,7 +16848,7 @@
               <w:rPr>
                 <w:sz w:val="20"/>
               </w:rPr>
-              <w:t>234286</w:t>
+              <w:t>$234,286</w:t>
             </w:r>
           </w:p>
         </w:tc>
@@ -17018,7 +16934,7 @@
               <w:rPr>
                 <w:sz w:val="20"/>
               </w:rPr>
-              <w:t>3500000</w:t>
+              <w:t>$3,500,000</w:t>
             </w:r>
           </w:p>
         </w:tc>
@@ -17032,7 +16948,7 @@
               <w:rPr>
                 <w:sz w:val="20"/>
               </w:rPr>
-              <w:t>53333</w:t>
+              <w:t>$53,333</w:t>
             </w:r>
           </w:p>
         </w:tc>
@@ -17118,7 +17034,7 @@
               <w:rPr>
                 <w:sz w:val="20"/>
               </w:rPr>
-              <w:t>9500000</w:t>
+              <w:t>$9,500,000</w:t>
             </w:r>
           </w:p>
         </w:tc>
@@ -17132,7 +17048,7 @@
               <w:rPr>
                 <w:sz w:val="20"/>
               </w:rPr>
-              <w:t>1125000</w:t>
+              <w:t>$1,125,000</w:t>
             </w:r>
           </w:p>
         </w:tc>
@@ -17218,7 +17134,7 @@
               <w:rPr>
                 <w:sz w:val="20"/>
               </w:rPr>
-              <w:t>3800000</w:t>
+              <w:t>$3,800,000</w:t>
             </w:r>
           </w:p>
         </w:tc>
@@ -17232,7 +17148,7 @@
               <w:rPr>
                 <w:sz w:val="20"/>
               </w:rPr>
-              <w:t>227273</w:t>
+              <w:t>$227,273</w:t>
             </w:r>
           </w:p>
         </w:tc>
@@ -17318,7 +17234,7 @@
               <w:rPr>
                 <w:sz w:val="20"/>
               </w:rPr>
-              <w:t>5500000</w:t>
+              <w:t>$5,500,000</w:t>
             </w:r>
           </w:p>
         </w:tc>
@@ -17332,7 +17248,7 @@
               <w:rPr>
                 <w:sz w:val="20"/>
               </w:rPr>
-              <w:t>250000</w:t>
+              <w:t>$250,000</w:t>
             </w:r>
           </w:p>
         </w:tc>
@@ -17346,7 +17262,7 @@
               <w:rPr>
                 <w:sz w:val="20"/>
               </w:rPr>
-              <w:t>Deep Distress</w:t>
+              <w:t>Severely Distressed</w:t>
             </w:r>
           </w:p>
         </w:tc>
@@ -17418,7 +17334,7 @@
               <w:rPr>
                 <w:sz w:val="20"/>
               </w:rPr>
-              <w:t>6500000</w:t>
+              <w:t>$6,500,000</w:t>
             </w:r>
           </w:p>
         </w:tc>
@@ -17432,7 +17348,7 @@
               <w:rPr>
                 <w:sz w:val="20"/>
               </w:rPr>
-              <w:t>187500</w:t>
+              <w:t>$187,500</w:t>
             </w:r>
           </w:p>
         </w:tc>
@@ -17518,7 +17434,7 @@
               <w:rPr>
                 <w:sz w:val="20"/>
               </w:rPr>
-              <w:t>5000000</w:t>
+              <w:t>$5,000,000</w:t>
             </w:r>
           </w:p>
         </w:tc>
@@ -17532,7 +17448,7 @@
               <w:rPr>
                 <w:sz w:val="20"/>
               </w:rPr>
-              <w:t>59091</w:t>
+              <w:t>$59,091</w:t>
             </w:r>
           </w:p>
         </w:tc>
@@ -17618,7 +17534,7 @@
               <w:rPr>
                 <w:sz w:val="20"/>
               </w:rPr>
-              <w:t>7500000</w:t>
+              <w:t>$7,500,000</w:t>
             </w:r>
           </w:p>
         </w:tc>
@@ -17632,7 +17548,7 @@
               <w:rPr>
                 <w:sz w:val="20"/>
               </w:rPr>
-              <w:t>300000</w:t>
+              <w:t>$300,000</w:t>
             </w:r>
           </w:p>
         </w:tc>
@@ -17718,7 +17634,7 @@
               <w:rPr>
                 <w:sz w:val="20"/>
               </w:rPr>
-              <w:t>3200000</w:t>
+              <w:t>$3,200,000</w:t>
             </w:r>
           </w:p>
         </w:tc>
@@ -17732,7 +17648,7 @@
               <w:rPr>
                 <w:sz w:val="20"/>
               </w:rPr>
-              <w:t>210000</w:t>
+              <w:t>$210,000</w:t>
             </w:r>
           </w:p>
         </w:tc>
@@ -17776,7 +17692,7 @@
               <w:rPr>
                 <w:sz w:val="20"/>
               </w:rPr>
-              <w:t>KS</w:t>
+              <w:t>MO</w:t>
             </w:r>
           </w:p>
         </w:tc>
@@ -17818,7 +17734,7 @@
               <w:rPr>
                 <w:sz w:val="20"/>
               </w:rPr>
-              <w:t>8500000</w:t>
+              <w:t>$8,500,000</w:t>
             </w:r>
           </w:p>
         </w:tc>
@@ -17832,7 +17748,7 @@
               <w:rPr>
                 <w:sz w:val="20"/>
               </w:rPr>
-              <w:t>1180000</w:t>
+              <w:t>$1,180,000</w:t>
             </w:r>
           </w:p>
         </w:tc>
@@ -17918,7 +17834,7 @@
               <w:rPr>
                 <w:sz w:val="20"/>
               </w:rPr>
-              <w:t>4200000</w:t>
+              <w:t>$4,200,000</w:t>
             </w:r>
           </w:p>
         </w:tc>
@@ -17932,7 +17848,7 @@
               <w:rPr>
                 <w:sz w:val="20"/>
               </w:rPr>
-              <w:t>128889</w:t>
+              <w:t>$128,889</w:t>
             </w:r>
           </w:p>
         </w:tc>
@@ -18018,7 +17934,7 @@
               <w:rPr>
                 <w:sz w:val="20"/>
               </w:rPr>
-              <w:t>5800000</w:t>
+              <w:t>$5,800,000</w:t>
             </w:r>
           </w:p>
         </w:tc>
@@ -18032,7 +17948,7 @@
               <w:rPr>
                 <w:sz w:val="20"/>
               </w:rPr>
-              <w:t>243750</w:t>
+              <w:t>$243,750</w:t>
             </w:r>
           </w:p>
         </w:tc>
@@ -18121,7 +18037,7 @@
                 <w:b/>
                 <w:sz w:val="20"/>
               </w:rPr>
-              <w:t>122500000</w:t>
+              <w:t>$122,500,000</w:t>
             </w:r>
           </w:p>
         </w:tc>
@@ -18136,7 +18052,7 @@
                 <w:b/>
                 <w:sz w:val="20"/>
               </w:rPr>
-              <w:t>141782</w:t>
+              <w:t>$141,782</w:t>
             </w:r>
           </w:p>
         </w:tc>
@@ -18916,7 +18832,7 @@
               <w:rPr>
                 <w:sz w:val="20"/>
               </w:rPr>
-              <w:t>40000000</w:t>
+              <w:t>$40,000,000</w:t>
             </w:r>
           </w:p>
         </w:tc>
@@ -19001,7 +18917,7 @@
               <w:rPr>
                 <w:sz w:val="20"/>
               </w:rPr>
-              <w:t>55000000</w:t>
+              <w:t>$55,000,000</w:t>
             </w:r>
           </w:p>
         </w:tc>
@@ -19086,7 +19002,7 @@
               <w:rPr>
                 <w:sz w:val="20"/>
               </w:rPr>
-              <w:t>60000000</w:t>
+              <w:t>$60,000,000</w:t>
             </w:r>
           </w:p>
         </w:tc>
@@ -19173,7 +19089,7 @@
                 <w:b/>
                 <w:sz w:val="20"/>
               </w:rPr>
-              <w:t>155000000</w:t>
+              <w:t>$155,000,000</w:t>
             </w:r>
           </w:p>
         </w:tc>
@@ -19261,16 +19177,16 @@
         <w:rPr>
           <w:sz w:val="22"/>
         </w:rPr>
-        <w:t>Generated by nmtc-application-builder v1.2.0 on 2026-08-15.</w:t>
+        <w:t>Generated by nmtc-application-builder v1.2.1 on 2026-08-16.</w:t>
         <w:br/>
         <w:br/>
         <w:t>ELIGIBILITY: CDFI Fund NMTC Eligibility Table using 2016–2020 ACS 5-Year Estimates. Tract eligibility determined by Low Income Community (LIC) criteria per IRC §45D.</w:t>
         <w:br/>
         <w:br/>
-        <w:t>DISTRESS LEVELS (verbatim from the CDFI Fund NMTC LIC Eligibility workbook, 2016-2020 ACS, columns 14 and 15 — the file this tool loads to classify every tract): Severe distress = LIC AND (Poverty&gt;30%; MFI&lt;=60%; Unemployment&gt;=1.5). Deep distress = LIC AND (Poverty&gt;40%; MFI&lt;=40%; Unemployment&gt;=2.5). The semicolons are ORs; both tiers additionally require the tract to be a Low-Income Community. NMTC rounds are announced by a NOAA — Notice of Allocation Availability — and the CY 2026 NOAA is not yet published.</w:t>
+        <w:t>DISTRESS LEVELS (quoted from the CDFI Fund NMTC LIC Eligibility workbook, 2016–2020 ACS, columns O and P — the file this tool loads to classify every tract; the criteria are the workbook's own, with spacing normalised for legibility): Severe distress = LIC AND (Poverty&gt;30%; MFI&lt;=60%; Unemployment&gt;=1.5). Deep distress = LIC AND (Poverty&gt;40%; MFI&lt;=40%; Unemployment&gt;=2.5). The semicolons are ORs; both tiers additionally require the tract to be a Low-Income Community. NMTC rounds are announced by a NOAA — Notice of Allocation Availability — and the CY 2026 NOAA is not yet published.</w:t>
         <w:br/>
         <w:br/>
-        <w:t>DEAL ECONOMICS: Computed using nmtc-calc library. Standard leveraged NMTC structure with credit price $0.83/credit, CDE fee 2.5% of QEI, 7-year compliance period.</w:t>
+        <w:t>DEAL ECONOMICS: computed using the nmtc-calc library, standard leveraged NMTC structure. Statutory credit rate 39% of QEI over 7 years (IRC §45D(a)(2): 5% of the QEI on each of the first three credit allowance dates and 6% on each of the remaining four). Assumed credit price $0.83/credit and CDE fee 2.5% of QEI are market assumptions of this model, not CDFI Fund parameters. The leverage loan is the residual of QEI less investor equity, so leverage plus equity equals QEI in every surface of this document.</w:t>
         <w:br/>
         <w:br/>
         <w:t>IMPACT SCREENING BANDS: THIS TOOL'S OWN BANDS (5 / 12 / 20 FTE per $1MM QEI). The CDFI Fund publishes no jobs-per-QEI benchmark in any denominator: it reports job counts and dollar counts separately and never divides them, and it publishes no distribution, so no band here is a percentile. These are not a federal figure and must not be cited as one.</w:t>

</xml_diff>

<commit_message>
Deployed 63443cc with MkDocs version: 1.6.1
</commit_message>
<xml_diff>
--- a/sample-output/CDE-2018-0117_application.docx
+++ b/sample-output/CDE-2018-0117_application.docx
@@ -182,7 +182,7 @@
                 <w:b w:val="0"/>
                 <w:sz w:val="22"/>
               </w:rPr>
-              <w:t>August 16, 2026</w:t>
+              <w:t>August 17, 2026</w:t>
             </w:r>
           </w:p>
         </w:tc>
@@ -19177,7 +19177,7 @@
         <w:rPr>
           <w:sz w:val="22"/>
         </w:rPr>
-        <w:t>Generated by nmtc-application-builder v1.2.1 on 2026-08-16.</w:t>
+        <w:t>Generated by nmtc-application-builder v1.2.1 on 2026-08-17.</w:t>
         <w:br/>
         <w:br/>
         <w:t>ELIGIBILITY: CDFI Fund NMTC Eligibility Table using 2016–2020 ACS 5-Year Estimates. Tract eligibility determined by Low Income Community (LIC) criteria per IRC §45D.</w:t>

</xml_diff>

<commit_message>
Deployed 0643296 with MkDocs version: 1.6.1
</commit_message>
<xml_diff>
--- a/sample-output/CDE-2018-0117_application.docx
+++ b/sample-output/CDE-2018-0117_application.docx
@@ -182,7 +182,7 @@
                 <w:b w:val="0"/>
                 <w:sz w:val="22"/>
               </w:rPr>
-              <w:t>August 17, 2026</w:t>
+              <w:t>August 19, 2026</w:t>
             </w:r>
           </w:p>
         </w:tc>
@@ -1434,7 +1434,7 @@
               <w:rPr>
                 <w:sz w:val="20"/>
               </w:rPr>
-              <w:t>The CY 2024-2025 NMTC Program Review Process (Targeting Areas of Higher Distress, Question 25) states two commitments, and both are measured on QLICIs: at least 85% of QLICIs in specified areas of severe distress and/or areas characterized by multiple indicia of distress, and at least 20% of QLICIs to 'Deep Distress' areas. Every share in this table is a share of QEI. nmtc-application-builder computes neither QLICI-denominated figure — it reads this pipeline's QLICI amounts only to print them in Appendix A and to check that each is no larger than its QEI — so no figure above answers either commitment, and none may be presented to the CDFI Fund as doing so. Two further gaps in the higher-distress commitment: it covers severe distress OR MULTIPLE INDICIA of distress, and this package computes no multi-indicia measure at all, so even the QLICI-denominated severe-distress share would be incomplete against it; and Deep Distress is a strict subset of severe distress, so the second row above already includes the first. The CDE must compute both QLICI-denominated shares from its own QLICI amounts before stating either commitment. (The CY 2026 NOAA is not yet published.)</w:t>
+              <w:t>Question 25 of the CY 2024-2025 NMTC Allocation Application (printed pp. 38-41) sets both commitments, and both are measured on QLICIs — specifically on QLICIs "in terms of aggregate dollar amounts", tested for each QLICI. Question 25(a) asks for at least 85% of QLICIs in areas characterized by at least ONE of items 1-5 (Severe Distress; NMTC Native Areas; U.S. Island Areas; Non-Metropolitan Counties; Targeted Populations) or by at least TWO of items 6-12 (25% poverty / 70% median family income / 1.25x unemployment; Brownfield Sites; ARC and/or DRA Areas; Colonias Areas; Federal Medically Underserved Areas; FEMA Disaster Areas; Low-Income and Low-Access to Supermarkets). "Multiple indicia of distress" is that two-of-seven test, applied per QLICI — not a loose notion of compounded distress and not a category of its own. Question 25(b)(i) is NOT a 20% bar. It is a selectable commitment level — 0, 5, 10, 15 or 20, and selecting 20 opens a field for any figure from 20% to 100% — over FOUR qualifying area types: Deep Distress, NMTC Native Areas, High Migration Rural Counties and U.S. Island Areas. A CDE that can honestly commit 10% selects 10 and has failed nothing; a CDE whose QLICIs sit in Native Areas, High Migration Rural Counties or Island Areas must count them, and no Deep Distress figure in this document does. The Application further states that "A QLICI that meets this commitment will also automatically meet the commitment made in Question 25(a)." Every distress share in this document is a share of QEI. nmtc-application-builder computes neither QLICI-denominated figure — it reads this pipeline's QLICI amounts only to print them in Appendix A and to check that each is no larger than its QEI — so no figure in this document answers either commitment, and none may be presented to the CDFI Fund as doing so. WHICH OF THE CDE'S QUALIFYING ROUTES ARE VISIBLE HERE: this package carries a per-project field for 5 of the 14 distinct area types Question 25 lists, and they do NOT share one provenance, so each is stated with its own. Severe Distress and Deep Distress: TOOL-VERIFIED — the distress level is read from the CDFI Fund eligibility table for the tract this package geocoded, and a CDE's own distress column is kept separately and labelled CDE-declared wherever it is shown. High Migration Rural Counties: CDE-DECLARED AND TOOL-VERIFIED — enrichment overwrites the CDE's declaration whenever nmtc-mapper returns a determination for the tract, so the declaration stands only where the tool reached none, and where enrichment did not run at all. NMTC Native Areas and U.S. territory: CDE-DECLARED AND TOOL-UNVERIFIED — nothing in this package checks either one, and a Native Area determination is a spatial intersection against the Fund's CIMS map rather than a tract-keyed lookup this package could perform (U.S. territory is the CDE's own word; the Application's U.S. Island Areas is a specific list of five). It carries NOTHING for Non-Metropolitan Counties, nothing for Targeted Populations, and nothing for any of items 6-12; it computes no multi-indicia measure at all. Holding those fields is not a partial answer to Question 25 and must not be read as one: the commitment is a share of QLICI DOLLARS, this package weights nothing by QLICI dollars, and a flag that enters no denominator contributes nothing to a share. Deep Distress is a strict subset of severe distress, so the severe-distress share already includes the deep-distress share. The CDE must compute both QLICI-denominated shares from its own QLICI amounts, against the Application's own area lists, before stating either commitment. (The CY 2026 NOAA is not yet published.)</w:t>
             </w:r>
           </w:p>
         </w:tc>
@@ -19177,7 +19177,7 @@
         <w:rPr>
           <w:sz w:val="22"/>
         </w:rPr>
-        <w:t>Generated by nmtc-application-builder v1.2.1 on 2026-08-17.</w:t>
+        <w:t>Generated by nmtc-application-builder v1.3.0 on 2026-08-19.</w:t>
         <w:br/>
         <w:br/>
         <w:t>ELIGIBILITY: CDFI Fund NMTC Eligibility Table using 2016–2020 ACS 5-Year Estimates. Tract eligibility determined by Low Income Community (LIC) criteria per IRC §45D.</w:t>

</xml_diff>

<commit_message>
Deployed c709d79 with MkDocs version: 1.6.1
</commit_message>
<xml_diff>
--- a/sample-output/CDE-2018-0117_application.docx
+++ b/sample-output/CDE-2018-0117_application.docx
@@ -182,7 +182,7 @@
                 <w:b w:val="0"/>
                 <w:sz w:val="22"/>
               </w:rPr>
-              <w:t>August 19, 2026</w:t>
+              <w:t>August 20, 2026</w:t>
             </w:r>
           </w:p>
         </w:tc>
@@ -1434,7 +1434,7 @@
               <w:rPr>
                 <w:sz w:val="20"/>
               </w:rPr>
-              <w:t>Question 25 of the CY 2024-2025 NMTC Allocation Application (printed pp. 38-41) sets both commitments, and both are measured on QLICIs — specifically on QLICIs "in terms of aggregate dollar amounts", tested for each QLICI. Question 25(a) asks for at least 85% of QLICIs in areas characterized by at least ONE of items 1-5 (Severe Distress; NMTC Native Areas; U.S. Island Areas; Non-Metropolitan Counties; Targeted Populations) or by at least TWO of items 6-12 (25% poverty / 70% median family income / 1.25x unemployment; Brownfield Sites; ARC and/or DRA Areas; Colonias Areas; Federal Medically Underserved Areas; FEMA Disaster Areas; Low-Income and Low-Access to Supermarkets). "Multiple indicia of distress" is that two-of-seven test, applied per QLICI — not a loose notion of compounded distress and not a category of its own. Question 25(b)(i) is NOT a 20% bar. It is a selectable commitment level — 0, 5, 10, 15 or 20, and selecting 20 opens a field for any figure from 20% to 100% — over FOUR qualifying area types: Deep Distress, NMTC Native Areas, High Migration Rural Counties and U.S. Island Areas. A CDE that can honestly commit 10% selects 10 and has failed nothing; a CDE whose QLICIs sit in Native Areas, High Migration Rural Counties or Island Areas must count them, and no Deep Distress figure in this document does. The Application further states that "A QLICI that meets this commitment will also automatically meet the commitment made in Question 25(a)." Every distress share in this document is a share of QEI. nmtc-application-builder computes neither QLICI-denominated figure — it reads this pipeline's QLICI amounts only to print them in Appendix A and to check that each is no larger than its QEI — so no figure in this document answers either commitment, and none may be presented to the CDFI Fund as doing so. WHICH OF THE CDE'S QUALIFYING ROUTES ARE VISIBLE HERE: this package carries a per-project field for 5 of the 14 distinct area types Question 25 lists, and they do NOT share one provenance, so each is stated with its own. Severe Distress and Deep Distress: TOOL-VERIFIED — the distress level is read from the CDFI Fund eligibility table for the tract this package geocoded, and a CDE's own distress column is kept separately and labelled CDE-declared wherever it is shown. High Migration Rural Counties: CDE-DECLARED AND TOOL-VERIFIED — enrichment overwrites the CDE's declaration whenever nmtc-mapper returns a determination for the tract, so the declaration stands only where the tool reached none, and where enrichment did not run at all. NMTC Native Areas and U.S. territory: CDE-DECLARED AND TOOL-UNVERIFIED — nothing in this package checks either one, and a Native Area determination is a spatial intersection against the Fund's CIMS map rather than a tract-keyed lookup this package could perform (U.S. territory is the CDE's own word; the Application's U.S. Island Areas is a specific list of five). It carries NOTHING for Non-Metropolitan Counties, nothing for Targeted Populations, and nothing for any of items 6-12; it computes no multi-indicia measure at all. Holding those fields is not a partial answer to Question 25 and must not be read as one: the commitment is a share of QLICI DOLLARS, this package weights nothing by QLICI dollars, and a flag that enters no denominator contributes nothing to a share. Deep Distress is a strict subset of severe distress, so the severe-distress share already includes the deep-distress share. The CDE must compute both QLICI-denominated shares from its own QLICI amounts, against the Application's own area lists, before stating either commitment. (The CY 2026 NOAA is not yet published.)</w:t>
+              <w:t>Question 25 of the CY 2024-2025 NMTC Allocation Application (printed pp. 38-41) sets both commitments, and both are measured on QLICIs — specifically on QLICIs "in terms of aggregate dollar amounts", tested for each QLICI. Question 25(a) asks for at least 85% of QLICIs in areas characterized by at least ONE of items 1-5 (Severe Distress; NMTC Native Areas; U.S. Island Areas; Non-Metropolitan Counties; Targeted Populations) or by at least TWO of items 6-12 (25% poverty / 70% median family income / 1.25x unemployment; Brownfield Sites; ARC and/or DRA Areas; Colonias Areas; Federal Medically Underserved Areas; FEMA Disaster Areas; Low-Income and Low-Access to Supermarkets). "Multiple indicia of distress" is that two-of-seven test, applied per QLICI — not a loose notion of compounded distress and not a category of its own. Question 25(b)(i) is NOT a 20% bar. It is a selectable commitment level — 0, 5, 10, 15 or 20, and selecting 20 opens a field for any figure from 20% to 100% — over FOUR qualifying area types: Deep Distress, NMTC Native Areas, High Migration Rural Counties and U.S. Island Areas. A CDE that can honestly commit 10% selects 10 and has failed nothing; a CDE whose QLICIs sit in Native Areas, High Migration Rural Counties or Island Areas must count them, and no Deep Distress figure in this document does. The Application further states that "A QLICI that meets this commitment will also automatically meet the commitment made in Question 25(a)." Every distress share in this document is a share of QEI. nmtc-application-builder computes neither QLICI-denominated figure — it reads this pipeline's QLICI amounts only to print them in Appendix A and to check that each is no larger than its QEI — so no figure in this document answers either commitment, and none may be presented to the CDFI Fund as doing so. WHICH OF THE CDE'S QUALIFYING ROUTES ARE VISIBLE HERE: this package carries a per-project field for 6 of the 14 distinct area types Question 25 lists, and they do NOT share one provenance, so each is stated with its own. Severe Distress and Deep Distress: TOOL-VERIFIED — the distress level is read from the CDFI Fund eligibility table for the tract this package geocoded, and a CDE's own distress column is kept separately and labelled CDE-declared wherever it is shown. High Migration Rural Counties: CDE-DECLARED AND TOOL-VERIFIED — enrichment overwrites the CDE's declaration whenever nmtc-mapper returns a determination for the tract, so the declaration stands only where the tool reached none, and where enrichment did not run at all. NMTC Native Areas and U.S. territory: CDE-DECLARED AND TOOL-UNVERIFIED — nothing in this package checks either one, and a Native Area determination is a spatial intersection against the Fund's CIMS map rather than a tract-keyed lookup this package could perform (U.S. territory is the CDE's own word; the Application's U.S. Island Areas is a specific list of five). Non-Metropolitan Counties: TOOL-VERIFIED AND TRI-STATE — the OMB designation is read for the same geocoded tract, and a project the lookup could not resolve is recorded as undetermined rather than as metropolitan, so no project is counted in a county type it was never determined to be in. It carries NOTHING for Targeted Populations and nothing for any of items 6-12; it computes no multi-indicia measure at all. Holding those fields is not a partial answer to Question 25 and must not be read as one: the commitment is a share of QLICI DOLLARS, this package weights nothing by QLICI dollars, and a flag that enters no denominator contributes nothing to a share. Deep Distress is a strict subset of severe distress, so the severe-distress share already includes the deep-distress share. The CDE must compute both QLICI-denominated shares from its own QLICI amounts, against the Application's own area lists, before stating either commitment. (The CY 2026 NOAA is not yet published.)</w:t>
             </w:r>
           </w:p>
         </w:tc>
@@ -19177,7 +19177,7 @@
         <w:rPr>
           <w:sz w:val="22"/>
         </w:rPr>
-        <w:t>Generated by nmtc-application-builder v1.3.1 on 2026-08-19.</w:t>
+        <w:t>Generated by nmtc-application-builder v1.4.0 on 2026-08-20.</w:t>
         <w:br/>
         <w:br/>
         <w:t>ELIGIBILITY: CDFI Fund NMTC Eligibility Table using 2016–2020 ACS 5-Year Estimates. Tract eligibility determined by Low Income Community (LIC) criteria per IRC §45D.</w:t>

</xml_diff>

<commit_message>
Deployed 0cb79e2 with MkDocs version: 1.6.1
</commit_message>
<xml_diff>
--- a/sample-output/CDE-2018-0117_application.docx
+++ b/sample-output/CDE-2018-0117_application.docx
@@ -182,7 +182,7 @@
                 <w:b w:val="0"/>
                 <w:sz w:val="22"/>
               </w:rPr>
-              <w:t>August 20, 2026</w:t>
+              <w:t>August 21, 2026</w:t>
             </w:r>
           </w:p>
         </w:tc>
@@ -19177,13 +19177,13 @@
         <w:rPr>
           <w:sz w:val="22"/>
         </w:rPr>
-        <w:t>Generated by nmtc-application-builder v1.4.0 on 2026-08-20.</w:t>
+        <w:t>Generated by nmtc-application-builder v1.5.0 on 2026-08-21.</w:t>
         <w:br/>
         <w:br/>
         <w:t>ELIGIBILITY: CDFI Fund NMTC Eligibility Table using 2016–2020 ACS 5-Year Estimates. Tract eligibility determined by Low Income Community (LIC) criteria per IRC §45D.</w:t>
         <w:br/>
         <w:br/>
-        <w:t>DISTRESS LEVELS (quoted from the CDFI Fund NMTC LIC Eligibility workbook, 2016–2020 ACS, columns O and P — the file this tool loads to classify every tract; the criteria are the workbook's own, with spacing normalised for legibility): Severe distress = LIC AND (Poverty&gt;30%; MFI&lt;=60%; Unemployment&gt;=1.5). Deep distress = LIC AND (Poverty&gt;40%; MFI&lt;=40%; Unemployment&gt;=2.5). The semicolons are ORs; both tiers additionally require the tract to be a Low-Income Community. NMTC rounds are announced by a NOAA — Notice of Allocation Availability — and the CY 2026 NOAA is not yet published.</w:t>
+        <w:t>DISTRESS LEVELS (quoted from the CDFI Fund NMTC LIC Eligibility workbook, 2016–2020 ACS, columns O and P — the file this tool loads to classify every tract; the criteria are the workbook's own, with spacing normalised for legibility): Severe distress = LIC AND (Poverty&gt;30%; MFI&lt;=60%; Unemployment&gt;=1.5). Deep distress = LIC AND (Poverty&gt;40%; MFI&lt;=40%; Unemployment&gt;=2.5). The semicolons are ORs; both tiers additionally require the tract to be a Low-Income Community. WHICH ROUND THIS IS BASED ON. This tool encodes the CY 2024-2025 NMTC Allocation Application, which is the most recent PUBLISHED Application and is closed and awarded (it opened 19 Nov 2024, closed 29 Jan 2025, and was awarded 23 Dec 2025 with $10 billion in allocation authority). The CY 2026 Allocation Application and NOAA are NOT YET PUBLISHED: the CDFI Fund has announced that CY 2026 will make $5 billion available — half the prior round — and that it will publish the round's Application Materials when the round opens. USE THIS, AND THEN RE-CHECK IT. The CY 2024-2025 Application is a real federal instrument and is the right basis to prepare against today; nothing here is unreliable. But it is a PROXY for the CY 2026 instrument, not that instrument, so every round-specific figure in this document must be re-verified against the CY 2026 materials once the Fund releases them — specifically: the allocation authority and the number of awards available; the CDE certification deadline for eligibility; Question 25's QLICI-denominated commitment levels, its area-type lists and its ladder; Question 22's QLICI-denominated Non-Metropolitan minimum and maximum; Question 15's product-flexibility ladder; the scoring thresholds in the Review Process. SEPARATELY, AND SOONER: to be eligible to apply in CY 2026, an organization must either already be a certified CDE as of the NOAA's Federal Register publication date, or have submitted its CDE Certification Application through AMIS by 11:59 p.m. ET on August 31, 2026. That deadline is not a figure this tool computes and it does not move with anything in this document. AND IF YOU ARE A PRIOR ALLOCATEE, A THIRD OBLIGATION FALLS ON THE SAME DATE: any prior Allocatee that requires action by the CDFI Fund — certifying a Subsidiary entity as a CDE, or adding a Subsidiary CDE to an Allocation Agreement — in order to meet the Qualified Equity Investment (QEI) issuance thresholds published in the CY 2026 NOAA must submit a CDE Certification Application for its Subsidiary CDE(s) through AMIS by 11:59 p.m. ET on August 31, 2026. Full eligibility information, including the QEI issuance thresholds themselves, comes with the NOAA when it publishes. Verified against cdfifund.gov on 2026-08-20.</w:t>
         <w:br/>
         <w:br/>
         <w:t>DEAL ECONOMICS: computed using the nmtc-calc library, standard leveraged NMTC structure. Statutory credit rate 39% of QEI over 7 years (IRC §45D(a)(2): 5% of the QEI on each of the first three credit allowance dates and 6% on each of the remaining four). Assumed credit price $0.83/credit and CDE fee 2.5% of QEI are market assumptions of this model, not CDFI Fund parameters. The leverage loan is the residual of QEI less investor equity, so leverage plus equity equals QEI in every surface of this document.</w:t>

</xml_diff>

<commit_message>
Deployed fde3eca with MkDocs version: 1.6.1
</commit_message>
<xml_diff>
--- a/sample-output/CDE-2018-0117_application.docx
+++ b/sample-output/CDE-2018-0117_application.docx
@@ -213,7 +213,7 @@
                 <w:b w:val="0"/>
                 <w:sz w:val="22"/>
               </w:rPr>
-              <w:t>Grade A — 86.6/100</w:t>
+              <w:t>Grade A — 86.6/100 (this tool's own unsourced house heuristic, not a CDFI Fund evaluation)</w:t>
             </w:r>
           </w:p>
         </w:tc>
@@ -655,6 +655,15 @@
         </w:tc>
       </w:tr>
     </w:tbl>
+    <w:p>
+      <w:r>
+        <w:rPr>
+          <w:i/>
+          <w:sz w:val="18"/>
+        </w:rPr>
+        <w:t>READINESS SCORE: An UNSOURCED HOUSE HEURISTIC of this tool (eligibility 25%, distress concentration 25%, geographic diversity 15%, impact metrics 20%, validation 10%, completeness 5%). The weights are this tool's own judgement; they are not calibrated against award data, the CDFI Fund publishes no such weighting, and the score does not predict an award outcome.</w:t>
+      </w:r>
+    </w:p>
     <w:p>
       <w:r>
         <w:br w:type="page"/>
@@ -19177,7 +19186,7 @@
         <w:rPr>
           <w:sz w:val="22"/>
         </w:rPr>
-        <w:t>Generated by nmtc-application-builder v1.5.0 on 2026-08-21.</w:t>
+        <w:t>Generated by nmtc-application-builder v1.5.1 on 2026-08-21.</w:t>
         <w:br/>
         <w:br/>
         <w:t>ELIGIBILITY: CDFI Fund NMTC Eligibility Table using 2016–2020 ACS 5-Year Estimates. Tract eligibility determined by Low Income Community (LIC) criteria per IRC §45D.</w:t>

</xml_diff>

<commit_message>
Deployed e483ae1 with MkDocs version: 1.6.1
</commit_message>
<xml_diff>
--- a/sample-output/CDE-2018-0117_application.docx
+++ b/sample-output/CDE-2018-0117_application.docx
@@ -182,7 +182,7 @@
                 <w:b w:val="0"/>
                 <w:sz w:val="22"/>
               </w:rPr>
-              <w:t>August 21, 2026</w:t>
+              <w:t>August 22, 2026</w:t>
             </w:r>
           </w:p>
         </w:tc>
@@ -19186,7 +19186,7 @@
         <w:rPr>
           <w:sz w:val="22"/>
         </w:rPr>
-        <w:t>Generated by nmtc-application-builder v1.5.1 on 2026-08-21.</w:t>
+        <w:t>Generated by nmtc-application-builder v1.5.2 on 2026-08-22.</w:t>
         <w:br/>
         <w:br/>
         <w:t>ELIGIBILITY: CDFI Fund NMTC Eligibility Table using 2016–2020 ACS 5-Year Estimates. Tract eligibility determined by Low Income Community (LIC) criteria per IRC §45D.</w:t>

</xml_diff>

<commit_message>
Deployed 1313aea with MkDocs version: 1.6.1
</commit_message>
<xml_diff>
--- a/sample-output/CDE-2018-0117_application.docx
+++ b/sample-output/CDE-2018-0117_application.docx
@@ -120,7 +120,7 @@
                 <w:b w:val="0"/>
                 <w:sz w:val="22"/>
               </w:rPr>
-              <w:t>CY2025</w:t>
+              <w:t>not specified — CDE to state</w:t>
             </w:r>
           </w:p>
         </w:tc>
@@ -182,7 +182,7 @@
                 <w:b w:val="0"/>
                 <w:sz w:val="22"/>
               </w:rPr>
-              <w:t>August 22, 2026</w:t>
+              <w:t>August 23, 2026</w:t>
             </w:r>
           </w:p>
         </w:tc>
@@ -269,7 +269,7 @@
         <w:rPr>
           <w:sz w:val="22"/>
         </w:rPr>
-        <w:t>Riverbend Community Capital CDE, LLC requests $65.0 million in New Markets Tax Credit allocation for CY2025. Our 20-project pipeline spans 19 states, with 87% of QEI committed to deep and severely distressed census tracts.</w:t>
+        <w:t>Riverbend Community Capital CDE, LLC requests $65.0 million in New Markets Tax Credit allocation. Our 20-project pipeline spans 19 states, with 87% of QEI committed to deep and severely distressed census tracts.</w:t>
       </w:r>
     </w:p>
     <w:p/>
@@ -1056,7 +1056,7 @@
         <w:rPr>
           <w:sz w:val="22"/>
         </w:rPr>
-        <w:t>Riverbend Community Capital CDE, LLC targets a CY2025 award.</w:t>
+        <w:t>Riverbend Community Capital CDE, LLC targets an NMTC allocation award. Application round: not specified — CDE to state.</w:t>
       </w:r>
     </w:p>
     <w:p>
@@ -19186,7 +19186,7 @@
         <w:rPr>
           <w:sz w:val="22"/>
         </w:rPr>
-        <w:t>Generated by nmtc-application-builder v1.5.4 on 2026-08-22.</w:t>
+        <w:t>Generated by nmtc-application-builder v1.5.5 on 2026-08-23.</w:t>
         <w:br/>
         <w:br/>
         <w:t>ELIGIBILITY: CDFI Fund NMTC Eligibility Table using 2016–2020 ACS 5-Year Estimates. Tract eligibility determined by Low Income Community (LIC) criteria per IRC §45D.</w:t>
@@ -19236,7 +19236,7 @@
         <w:color w:val="6B6B6B"/>
         <w:sz w:val="16"/>
       </w:rPr>
-      <w:t xml:space="preserve">  |  Riverbend Community Capital CDE, LLC — NMTC CY2025 Application  |  CONFIDENTIAL</w:t>
+      <w:t xml:space="preserve">  |  Riverbend Community Capital CDE, LLC — NMTC Application  |  CONFIDENTIAL</w:t>
     </w:r>
   </w:p>
 </w:ftr>
@@ -19263,7 +19263,7 @@
         <w:color w:val="6B6B6B"/>
         <w:sz w:val="16"/>
       </w:rPr>
-      <w:t xml:space="preserve">  |  Riverbend Community Capital CDE, LLC — NMTC CY2025 Application  |  CONFIDENTIAL</w:t>
+      <w:t xml:space="preserve">  |  Riverbend Community Capital CDE, LLC — NMTC Application  |  CONFIDENTIAL</w:t>
     </w:r>
   </w:p>
 </w:ftr>
@@ -19290,7 +19290,7 @@
         <w:color w:val="6B6B6B"/>
         <w:sz w:val="16"/>
       </w:rPr>
-      <w:t xml:space="preserve">  |  Riverbend Community Capital CDE, LLC — NMTC CY2025 Application  |  CONFIDENTIAL</w:t>
+      <w:t xml:space="preserve">  |  Riverbend Community Capital CDE, LLC — NMTC Application  |  CONFIDENTIAL</w:t>
     </w:r>
   </w:p>
 </w:ftr>
@@ -19317,7 +19317,7 @@
         <w:color w:val="6B6B6B"/>
         <w:sz w:val="16"/>
       </w:rPr>
-      <w:t xml:space="preserve">  |  Riverbend Community Capital CDE, LLC — NMTC CY2025 Application  |  CONFIDENTIAL</w:t>
+      <w:t xml:space="preserve">  |  Riverbend Community Capital CDE, LLC — NMTC Application  |  CONFIDENTIAL</w:t>
     </w:r>
   </w:p>
 </w:ftr>
@@ -19344,7 +19344,7 @@
         <w:color w:val="6B6B6B"/>
         <w:sz w:val="16"/>
       </w:rPr>
-      <w:t xml:space="preserve">  |  Riverbend Community Capital CDE, LLC — NMTC CY2025 Application  |  CONFIDENTIAL</w:t>
+      <w:t xml:space="preserve">  |  Riverbend Community Capital CDE, LLC — NMTC Application  |  CONFIDENTIAL</w:t>
     </w:r>
   </w:p>
 </w:ftr>

</xml_diff>